<commit_message>
P12 - kerangka Vue di folder kosong
</commit_message>
<xml_diff>
--- a/worksheet-p12/25523236-Diah Putri Pertiwi.docx
+++ b/worksheet-p12/25523236-Diah Putri Pertiwi.docx
@@ -3305,7 +3305,41 @@
               <w:spacing w:before="20" w:after="20" w:line="252" w:lineRule="auto"/>
             </w:pPr>
             <w:r>
-              <w:t>5173 (http://localhost:5173/)</w:t>
+              <w:drawing>
+                <wp:inline distT="0" distB="0" distL="0" distR="0" wp14:anchorId="3CE91959" wp14:editId="557E3463">
+                  <wp:extent cx="1831975" cy="773430"/>
+                  <wp:effectExtent l="0" t="0" r="0" b="7620"/>
+                  <wp:docPr id="1204425572" name="Picture 1"/>
+                  <wp:cNvGraphicFramePr>
+                    <a:graphicFrameLocks xmlns:a="http://schemas.openxmlformats.org/drawingml/2006/main" noChangeAspect="1"/>
+                  </wp:cNvGraphicFramePr>
+                  <a:graphic xmlns:a="http://schemas.openxmlformats.org/drawingml/2006/main">
+                    <a:graphicData uri="http://schemas.openxmlformats.org/drawingml/2006/picture">
+                      <pic:pic xmlns:pic="http://schemas.openxmlformats.org/drawingml/2006/picture">
+                        <pic:nvPicPr>
+                          <pic:cNvPr id="1204425572" name=""/>
+                          <pic:cNvPicPr/>
+                        </pic:nvPicPr>
+                        <pic:blipFill>
+                          <a:blip r:embed="rId11"/>
+                          <a:stretch>
+                            <a:fillRect/>
+                          </a:stretch>
+                        </pic:blipFill>
+                        <pic:spPr>
+                          <a:xfrm>
+                            <a:off x="0" y="0"/>
+                            <a:ext cx="1831975" cy="773430"/>
+                          </a:xfrm>
+                          <a:prstGeom prst="rect">
+                            <a:avLst/>
+                          </a:prstGeom>
+                        </pic:spPr>
+                      </pic:pic>
+                    </a:graphicData>
+                  </a:graphic>
+                </wp:inline>
+              </w:drawing>
             </w:r>
           </w:p>
         </w:tc>
@@ -5751,6 +5785,43 @@
             <w:pPr>
               <w:spacing w:before="20" w:after="20" w:line="252" w:lineRule="auto"/>
             </w:pPr>
+            <w:r>
+              <w:drawing>
+                <wp:inline distT="0" distB="0" distL="0" distR="0" wp14:anchorId="545FD3D7" wp14:editId="7B4ECB4C">
+                  <wp:extent cx="1831975" cy="1806575"/>
+                  <wp:effectExtent l="0" t="0" r="0" b="3175"/>
+                  <wp:docPr id="2025114112" name="Picture 1"/>
+                  <wp:cNvGraphicFramePr>
+                    <a:graphicFrameLocks xmlns:a="http://schemas.openxmlformats.org/drawingml/2006/main" noChangeAspect="1"/>
+                  </wp:cNvGraphicFramePr>
+                  <a:graphic xmlns:a="http://schemas.openxmlformats.org/drawingml/2006/main">
+                    <a:graphicData uri="http://schemas.openxmlformats.org/drawingml/2006/picture">
+                      <pic:pic xmlns:pic="http://schemas.openxmlformats.org/drawingml/2006/picture">
+                        <pic:nvPicPr>
+                          <pic:cNvPr id="2025114112" name=""/>
+                          <pic:cNvPicPr/>
+                        </pic:nvPicPr>
+                        <pic:blipFill>
+                          <a:blip r:embed="rId12"/>
+                          <a:stretch>
+                            <a:fillRect/>
+                          </a:stretch>
+                        </pic:blipFill>
+                        <pic:spPr>
+                          <a:xfrm>
+                            <a:off x="0" y="0"/>
+                            <a:ext cx="1831975" cy="1806575"/>
+                          </a:xfrm>
+                          <a:prstGeom prst="rect">
+                            <a:avLst/>
+                          </a:prstGeom>
+                        </pic:spPr>
+                      </pic:pic>
+                    </a:graphicData>
+                  </a:graphic>
+                </wp:inline>
+              </w:drawing>
+            </w:r>
           </w:p>
         </w:tc>
       </w:tr>
@@ -5819,7 +5890,59 @@
           <w:p>
             <w:pPr>
               <w:spacing w:before="20" w:after="20" w:line="252" w:lineRule="auto"/>
-            </w:pPr>
+              <w:rPr>
+                <w:lang w:val="en-ID"/>
+              </w:rPr>
+            </w:pPr>
+            <w:r>
+              <w:rPr>
+                <w:lang w:val="en-ID"/>
+              </w:rPr>
+              <w:drawing>
+                <wp:inline distT="0" distB="0" distL="0" distR="0" wp14:anchorId="7038C42D" wp14:editId="66B808D0">
+                  <wp:extent cx="1705366" cy="807085"/>
+                  <wp:effectExtent l="0" t="0" r="9525" b="0"/>
+                  <wp:docPr id="1225941731" name="Picture 1"/>
+                  <wp:cNvGraphicFramePr>
+                    <a:graphicFrameLocks xmlns:a="http://schemas.openxmlformats.org/drawingml/2006/main" noChangeAspect="1"/>
+                  </wp:cNvGraphicFramePr>
+                  <a:graphic xmlns:a="http://schemas.openxmlformats.org/drawingml/2006/main">
+                    <a:graphicData uri="http://schemas.openxmlformats.org/drawingml/2006/picture">
+                      <pic:pic xmlns:pic="http://schemas.openxmlformats.org/drawingml/2006/picture">
+                        <pic:nvPicPr>
+                          <pic:cNvPr id="1225941731" name=""/>
+                          <pic:cNvPicPr/>
+                        </pic:nvPicPr>
+                        <pic:blipFill rotWithShape="1">
+                          <a:blip r:embed="rId13"/>
+                          <a:srcRect l="6911"/>
+                          <a:stretch>
+                            <a:fillRect/>
+                          </a:stretch>
+                        </pic:blipFill>
+                        <pic:spPr bwMode="auto">
+                          <a:xfrm>
+                            <a:off x="0" y="0"/>
+                            <a:ext cx="1705366" cy="807085"/>
+                          </a:xfrm>
+                          <a:prstGeom prst="rect">
+                            <a:avLst/>
+                          </a:prstGeom>
+                          <a:ln>
+                            <a:noFill/>
+                          </a:ln>
+                          <a:extLst>
+                            <a:ext uri="{53640926-AAD7-44D8-BBD7-CCE9431645EC}">
+                              <a14:shadowObscured xmlns:a14="http://schemas.microsoft.com/office/drawing/2010/main"/>
+                            </a:ext>
+                          </a:extLst>
+                        </pic:spPr>
+                      </pic:pic>
+                    </a:graphicData>
+                  </a:graphic>
+                </wp:inline>
+              </w:drawing>
+            </w:r>
           </w:p>
         </w:tc>
       </w:tr>
@@ -5889,6 +6012,43 @@
             <w:pPr>
               <w:spacing w:before="20" w:after="20" w:line="252" w:lineRule="auto"/>
             </w:pPr>
+            <w:r>
+              <w:drawing>
+                <wp:inline distT="0" distB="0" distL="0" distR="0" wp14:anchorId="753A8966" wp14:editId="61B60C15">
+                  <wp:extent cx="1831975" cy="659765"/>
+                  <wp:effectExtent l="0" t="0" r="0" b="6985"/>
+                  <wp:docPr id="960807922" name="Picture 1"/>
+                  <wp:cNvGraphicFramePr>
+                    <a:graphicFrameLocks xmlns:a="http://schemas.openxmlformats.org/drawingml/2006/main" noChangeAspect="1"/>
+                  </wp:cNvGraphicFramePr>
+                  <a:graphic xmlns:a="http://schemas.openxmlformats.org/drawingml/2006/main">
+                    <a:graphicData uri="http://schemas.openxmlformats.org/drawingml/2006/picture">
+                      <pic:pic xmlns:pic="http://schemas.openxmlformats.org/drawingml/2006/picture">
+                        <pic:nvPicPr>
+                          <pic:cNvPr id="960807922" name=""/>
+                          <pic:cNvPicPr/>
+                        </pic:nvPicPr>
+                        <pic:blipFill>
+                          <a:blip r:embed="rId14"/>
+                          <a:stretch>
+                            <a:fillRect/>
+                          </a:stretch>
+                        </pic:blipFill>
+                        <pic:spPr>
+                          <a:xfrm>
+                            <a:off x="0" y="0"/>
+                            <a:ext cx="1831975" cy="659765"/>
+                          </a:xfrm>
+                          <a:prstGeom prst="rect">
+                            <a:avLst/>
+                          </a:prstGeom>
+                        </pic:spPr>
+                      </pic:pic>
+                    </a:graphicData>
+                  </a:graphic>
+                </wp:inline>
+              </w:drawing>
+            </w:r>
           </w:p>
         </w:tc>
       </w:tr>
@@ -5958,6 +6118,43 @@
             <w:pPr>
               <w:spacing w:before="20" w:after="20" w:line="252" w:lineRule="auto"/>
             </w:pPr>
+            <w:r>
+              <w:drawing>
+                <wp:inline distT="0" distB="0" distL="0" distR="0" wp14:anchorId="6EF5A2F8" wp14:editId="6079EE91">
+                  <wp:extent cx="1831975" cy="1984375"/>
+                  <wp:effectExtent l="0" t="0" r="0" b="0"/>
+                  <wp:docPr id="694693015" name="Picture 1"/>
+                  <wp:cNvGraphicFramePr>
+                    <a:graphicFrameLocks xmlns:a="http://schemas.openxmlformats.org/drawingml/2006/main" noChangeAspect="1"/>
+                  </wp:cNvGraphicFramePr>
+                  <a:graphic xmlns:a="http://schemas.openxmlformats.org/drawingml/2006/main">
+                    <a:graphicData uri="http://schemas.openxmlformats.org/drawingml/2006/picture">
+                      <pic:pic xmlns:pic="http://schemas.openxmlformats.org/drawingml/2006/picture">
+                        <pic:nvPicPr>
+                          <pic:cNvPr id="694693015" name=""/>
+                          <pic:cNvPicPr/>
+                        </pic:nvPicPr>
+                        <pic:blipFill>
+                          <a:blip r:embed="rId15"/>
+                          <a:stretch>
+                            <a:fillRect/>
+                          </a:stretch>
+                        </pic:blipFill>
+                        <pic:spPr>
+                          <a:xfrm>
+                            <a:off x="0" y="0"/>
+                            <a:ext cx="1831975" cy="1984375"/>
+                          </a:xfrm>
+                          <a:prstGeom prst="rect">
+                            <a:avLst/>
+                          </a:prstGeom>
+                        </pic:spPr>
+                      </pic:pic>
+                    </a:graphicData>
+                  </a:graphic>
+                </wp:inline>
+              </w:drawing>
+            </w:r>
           </w:p>
         </w:tc>
       </w:tr>
@@ -5986,6 +6183,7 @@
                 <w:rFonts w:cs="Carlito"/>
                 <w:sz w:val="18"/>
               </w:rPr>
+              <w:lastRenderedPageBreak/>
               <w:t>Git status</w:t>
             </w:r>
           </w:p>
@@ -6027,6 +6225,43 @@
             <w:pPr>
               <w:spacing w:before="20" w:after="20" w:line="252" w:lineRule="auto"/>
             </w:pPr>
+            <w:r>
+              <w:drawing>
+                <wp:inline distT="0" distB="0" distL="0" distR="0" wp14:anchorId="6BDA2EDF" wp14:editId="2C450A10">
+                  <wp:extent cx="1831975" cy="1235075"/>
+                  <wp:effectExtent l="0" t="0" r="0" b="3175"/>
+                  <wp:docPr id="910344480" name="Picture 1"/>
+                  <wp:cNvGraphicFramePr>
+                    <a:graphicFrameLocks xmlns:a="http://schemas.openxmlformats.org/drawingml/2006/main" noChangeAspect="1"/>
+                  </wp:cNvGraphicFramePr>
+                  <a:graphic xmlns:a="http://schemas.openxmlformats.org/drawingml/2006/main">
+                    <a:graphicData uri="http://schemas.openxmlformats.org/drawingml/2006/picture">
+                      <pic:pic xmlns:pic="http://schemas.openxmlformats.org/drawingml/2006/picture">
+                        <pic:nvPicPr>
+                          <pic:cNvPr id="910344480" name=""/>
+                          <pic:cNvPicPr/>
+                        </pic:nvPicPr>
+                        <pic:blipFill>
+                          <a:blip r:embed="rId16"/>
+                          <a:stretch>
+                            <a:fillRect/>
+                          </a:stretch>
+                        </pic:blipFill>
+                        <pic:spPr>
+                          <a:xfrm>
+                            <a:off x="0" y="0"/>
+                            <a:ext cx="1831975" cy="1235075"/>
+                          </a:xfrm>
+                          <a:prstGeom prst="rect">
+                            <a:avLst/>
+                          </a:prstGeom>
+                        </pic:spPr>
+                      </pic:pic>
+                    </a:graphicData>
+                  </a:graphic>
+                </wp:inline>
+              </w:drawing>
+            </w:r>
           </w:p>
         </w:tc>
       </w:tr>
@@ -16898,7 +17133,42 @@
           <w:rFonts w:cs="Carlito"/>
           <w:sz w:val="20"/>
         </w:rPr>
-        <w:t>Tanda tangan: ______________________________     Tanggal: ______________     Jam selesai: __________</w:t>
+        <w:t xml:space="preserve">Tanda tangan: </w:t>
+      </w:r>
+      <w:r>
+        <w:rPr>
+          <w:rFonts w:cs="Carlito"/>
+          <w:sz w:val="20"/>
+        </w:rPr>
+        <w:t>Diah Putri Pertiwi</w:t>
+      </w:r>
+      <w:r>
+        <w:rPr>
+          <w:rFonts w:cs="Carlito"/>
+          <w:sz w:val="20"/>
+        </w:rPr>
+        <w:t xml:space="preserve">     Tanggal: </w:t>
+      </w:r>
+      <w:r>
+        <w:rPr>
+          <w:rFonts w:cs="Carlito"/>
+          <w:sz w:val="20"/>
+        </w:rPr>
+        <w:t>20 Oktober 2026</w:t>
+      </w:r>
+      <w:r>
+        <w:rPr>
+          <w:rFonts w:cs="Carlito"/>
+          <w:sz w:val="20"/>
+        </w:rPr>
+        <w:t xml:space="preserve">    Jam selesai: </w:t>
+      </w:r>
+      <w:r>
+        <w:rPr>
+          <w:rFonts w:cs="Carlito"/>
+          <w:sz w:val="20"/>
+        </w:rPr>
+        <w:t>21.00</w:t>
       </w:r>
     </w:p>
     <w:p>
@@ -18250,11 +18520,16 @@
           <w:p>
             <w:pPr>
               <w:spacing w:before="20" w:after="20" w:line="252" w:lineRule="auto"/>
-            </w:pPr>
-            <w:r>
-              <w:rPr>
-                <w:rFonts w:cs="Carlito"/>
-                <w:sz w:val="19"/>
+              <w:rPr>
+                <w:sz w:val="20"/>
+                <w:szCs w:val="20"/>
+              </w:rPr>
+            </w:pPr>
+            <w:r>
+              <w:rPr>
+                <w:rFonts w:cs="Carlito"/>
+                <w:sz w:val="20"/>
+                <w:szCs w:val="20"/>
               </w:rPr>
               <w:t>npm create vite@latest . -- --template vue</w:t>
             </w:r>
@@ -18273,11 +18548,16 @@
           <w:p>
             <w:pPr>
               <w:spacing w:before="20" w:after="20" w:line="252" w:lineRule="auto"/>
-            </w:pPr>
-            <w:r>
-              <w:rPr>
-                <w:rFonts w:cs="Carlito"/>
-                <w:sz w:val="19"/>
+              <w:rPr>
+                <w:sz w:val="20"/>
+                <w:szCs w:val="20"/>
+              </w:rPr>
+            </w:pPr>
+            <w:r>
+              <w:rPr>
+                <w:rFonts w:cs="Carlito"/>
+                <w:sz w:val="20"/>
+                <w:szCs w:val="20"/>
               </w:rPr>
               <w:t>Membuat kerangka proyek di folder ini</w:t>
             </w:r>
@@ -18296,7 +18576,18 @@
           <w:p>
             <w:pPr>
               <w:spacing w:before="20" w:after="20" w:line="252" w:lineRule="auto"/>
-            </w:pPr>
+              <w:rPr>
+                <w:sz w:val="20"/>
+                <w:szCs w:val="20"/>
+              </w:rPr>
+            </w:pPr>
+            <w:r>
+              <w:rPr>
+                <w:sz w:val="20"/>
+                <w:szCs w:val="20"/>
+              </w:rPr>
+              <w:t>Saat membuat proyek React baru menggunakan Vite.</w:t>
+            </w:r>
           </w:p>
         </w:tc>
       </w:tr>
@@ -18319,11 +18610,16 @@
           <w:p>
             <w:pPr>
               <w:spacing w:before="20" w:after="20" w:line="252" w:lineRule="auto"/>
-            </w:pPr>
-            <w:r>
-              <w:rPr>
-                <w:rFonts w:cs="Carlito"/>
-                <w:sz w:val="19"/>
+              <w:rPr>
+                <w:sz w:val="20"/>
+                <w:szCs w:val="20"/>
+              </w:rPr>
+            </w:pPr>
+            <w:r>
+              <w:rPr>
+                <w:rFonts w:cs="Carlito"/>
+                <w:sz w:val="20"/>
+                <w:szCs w:val="20"/>
               </w:rPr>
               <w:t>npm install</w:t>
             </w:r>
@@ -18342,11 +18638,16 @@
           <w:p>
             <w:pPr>
               <w:spacing w:before="20" w:after="20" w:line="252" w:lineRule="auto"/>
-            </w:pPr>
-            <w:r>
-              <w:rPr>
-                <w:rFonts w:cs="Carlito"/>
-                <w:sz w:val="19"/>
+              <w:rPr>
+                <w:sz w:val="20"/>
+                <w:szCs w:val="20"/>
+              </w:rPr>
+            </w:pPr>
+            <w:r>
+              <w:rPr>
+                <w:rFonts w:cs="Carlito"/>
+                <w:sz w:val="20"/>
+                <w:szCs w:val="20"/>
               </w:rPr>
               <w:t>Memasang paket sesuai package.json</w:t>
             </w:r>
@@ -18365,7 +18666,18 @@
           <w:p>
             <w:pPr>
               <w:spacing w:before="20" w:after="20" w:line="252" w:lineRule="auto"/>
-            </w:pPr>
+              <w:rPr>
+                <w:sz w:val="20"/>
+                <w:szCs w:val="20"/>
+              </w:rPr>
+            </w:pPr>
+            <w:r>
+              <w:rPr>
+                <w:sz w:val="20"/>
+                <w:szCs w:val="20"/>
+              </w:rPr>
+              <w:t>Saat pertama kali memasang semua package atau dependensi yang dibutuhkan proyek.</w:t>
+            </w:r>
           </w:p>
         </w:tc>
       </w:tr>
@@ -18388,11 +18700,16 @@
           <w:p>
             <w:pPr>
               <w:spacing w:before="20" w:after="20" w:line="252" w:lineRule="auto"/>
-            </w:pPr>
-            <w:r>
-              <w:rPr>
-                <w:rFonts w:cs="Carlito"/>
-                <w:sz w:val="19"/>
+              <w:rPr>
+                <w:sz w:val="20"/>
+                <w:szCs w:val="20"/>
+              </w:rPr>
+            </w:pPr>
+            <w:r>
+              <w:rPr>
+                <w:rFonts w:cs="Carlito"/>
+                <w:sz w:val="20"/>
+                <w:szCs w:val="20"/>
               </w:rPr>
               <w:t>npm run dev</w:t>
             </w:r>
@@ -18411,11 +18728,16 @@
           <w:p>
             <w:pPr>
               <w:spacing w:before="20" w:after="20" w:line="252" w:lineRule="auto"/>
-            </w:pPr>
-            <w:r>
-              <w:rPr>
-                <w:rFonts w:cs="Carlito"/>
-                <w:sz w:val="19"/>
+              <w:rPr>
+                <w:sz w:val="20"/>
+                <w:szCs w:val="20"/>
+              </w:rPr>
+            </w:pPr>
+            <w:r>
+              <w:rPr>
+                <w:rFonts w:cs="Carlito"/>
+                <w:sz w:val="20"/>
+                <w:szCs w:val="20"/>
               </w:rPr>
               <w:t>Menjalankan server pengembangan</w:t>
             </w:r>
@@ -18434,7 +18756,18 @@
           <w:p>
             <w:pPr>
               <w:spacing w:before="20" w:after="20" w:line="252" w:lineRule="auto"/>
-            </w:pPr>
+              <w:rPr>
+                <w:sz w:val="20"/>
+                <w:szCs w:val="20"/>
+              </w:rPr>
+            </w:pPr>
+            <w:r>
+              <w:rPr>
+                <w:sz w:val="20"/>
+                <w:szCs w:val="20"/>
+              </w:rPr>
+              <w:t>Saat menjalankan aplikasi dalam mode pengembangan agar bisa melihat perubahan secara langsung.</w:t>
+            </w:r>
           </w:p>
         </w:tc>
       </w:tr>
@@ -18457,11 +18790,16 @@
           <w:p>
             <w:pPr>
               <w:spacing w:before="20" w:after="20" w:line="252" w:lineRule="auto"/>
-            </w:pPr>
-            <w:r>
-              <w:rPr>
-                <w:rFonts w:cs="Carlito"/>
-                <w:sz w:val="19"/>
+              <w:rPr>
+                <w:sz w:val="20"/>
+                <w:szCs w:val="20"/>
+              </w:rPr>
+            </w:pPr>
+            <w:r>
+              <w:rPr>
+                <w:rFonts w:cs="Carlito"/>
+                <w:sz w:val="20"/>
+                <w:szCs w:val="20"/>
               </w:rPr>
               <w:t>npm run build</w:t>
             </w:r>
@@ -18480,11 +18818,16 @@
           <w:p>
             <w:pPr>
               <w:spacing w:before="20" w:after="20" w:line="252" w:lineRule="auto"/>
-            </w:pPr>
-            <w:r>
-              <w:rPr>
-                <w:rFonts w:cs="Carlito"/>
-                <w:sz w:val="19"/>
+              <w:rPr>
+                <w:sz w:val="20"/>
+                <w:szCs w:val="20"/>
+              </w:rPr>
+            </w:pPr>
+            <w:r>
+              <w:rPr>
+                <w:rFonts w:cs="Carlito"/>
+                <w:sz w:val="20"/>
+                <w:szCs w:val="20"/>
               </w:rPr>
               <w:t>Menghasilkan folder dist/</w:t>
             </w:r>
@@ -18503,7 +18846,18 @@
           <w:p>
             <w:pPr>
               <w:spacing w:before="20" w:after="20" w:line="252" w:lineRule="auto"/>
-            </w:pPr>
+              <w:rPr>
+                <w:sz w:val="20"/>
+                <w:szCs w:val="20"/>
+              </w:rPr>
+            </w:pPr>
+            <w:r>
+              <w:rPr>
+                <w:sz w:val="20"/>
+                <w:szCs w:val="20"/>
+              </w:rPr>
+              <w:t>Saat menyiapkan aplikasi untuk produksi dengan menghasilkan folder dist/.</w:t>
+            </w:r>
           </w:p>
         </w:tc>
       </w:tr>
@@ -18526,11 +18880,16 @@
           <w:p>
             <w:pPr>
               <w:spacing w:before="20" w:after="20" w:line="252" w:lineRule="auto"/>
-            </w:pPr>
-            <w:r>
-              <w:rPr>
-                <w:rFonts w:cs="Carlito"/>
-                <w:sz w:val="19"/>
+              <w:rPr>
+                <w:sz w:val="20"/>
+                <w:szCs w:val="20"/>
+              </w:rPr>
+            </w:pPr>
+            <w:r>
+              <w:rPr>
+                <w:rFonts w:cs="Carlito"/>
+                <w:sz w:val="20"/>
+                <w:szCs w:val="20"/>
               </w:rPr>
               <w:t>npm run preview</w:t>
             </w:r>
@@ -18549,11 +18908,16 @@
           <w:p>
             <w:pPr>
               <w:spacing w:before="20" w:after="20" w:line="252" w:lineRule="auto"/>
-            </w:pPr>
-            <w:r>
-              <w:rPr>
-                <w:rFonts w:cs="Carlito"/>
-                <w:sz w:val="19"/>
+              <w:rPr>
+                <w:sz w:val="20"/>
+                <w:szCs w:val="20"/>
+              </w:rPr>
+            </w:pPr>
+            <w:r>
+              <w:rPr>
+                <w:rFonts w:cs="Carlito"/>
+                <w:sz w:val="20"/>
+                <w:szCs w:val="20"/>
               </w:rPr>
               <w:t>Menjalankan isi dist/</w:t>
             </w:r>
@@ -18572,7 +18936,18 @@
           <w:p>
             <w:pPr>
               <w:spacing w:before="20" w:after="20" w:line="252" w:lineRule="auto"/>
-            </w:pPr>
+              <w:rPr>
+                <w:sz w:val="20"/>
+                <w:szCs w:val="20"/>
+              </w:rPr>
+            </w:pPr>
+            <w:r>
+              <w:rPr>
+                <w:sz w:val="20"/>
+                <w:szCs w:val="20"/>
+              </w:rPr>
+              <w:t>Saat ingin melihat hasil build aplikasi secara lokal sebelum dipublikasikan.</w:t>
+            </w:r>
           </w:p>
         </w:tc>
       </w:tr>
@@ -18595,12 +18970,18 @@
           <w:p>
             <w:pPr>
               <w:spacing w:before="20" w:after="20" w:line="252" w:lineRule="auto"/>
-            </w:pPr>
-            <w:r>
-              <w:rPr>
-                <w:rFonts w:cs="Carlito"/>
-                <w:sz w:val="19"/>
-              </w:rPr>
+              <w:rPr>
+                <w:sz w:val="20"/>
+                <w:szCs w:val="20"/>
+              </w:rPr>
+            </w:pPr>
+            <w:r>
+              <w:rPr>
+                <w:rFonts w:cs="Carlito"/>
+                <w:sz w:val="20"/>
+                <w:szCs w:val="20"/>
+              </w:rPr>
+              <w:lastRenderedPageBreak/>
               <w:t>package.json</w:t>
             </w:r>
           </w:p>
@@ -18618,11 +18999,16 @@
           <w:p>
             <w:pPr>
               <w:spacing w:before="20" w:after="20" w:line="252" w:lineRule="auto"/>
-            </w:pPr>
-            <w:r>
-              <w:rPr>
-                <w:rFonts w:cs="Carlito"/>
-                <w:sz w:val="19"/>
+              <w:rPr>
+                <w:sz w:val="20"/>
+                <w:szCs w:val="20"/>
+              </w:rPr>
+            </w:pPr>
+            <w:r>
+              <w:rPr>
+                <w:rFonts w:cs="Carlito"/>
+                <w:sz w:val="20"/>
+                <w:szCs w:val="20"/>
               </w:rPr>
               <w:t>Daftar isi proyek</w:t>
             </w:r>
@@ -18641,7 +19027,18 @@
           <w:p>
             <w:pPr>
               <w:spacing w:before="20" w:after="20" w:line="252" w:lineRule="auto"/>
-            </w:pPr>
+              <w:rPr>
+                <w:sz w:val="20"/>
+                <w:szCs w:val="20"/>
+              </w:rPr>
+            </w:pPr>
+            <w:r>
+              <w:rPr>
+                <w:sz w:val="20"/>
+                <w:szCs w:val="20"/>
+              </w:rPr>
+              <w:t>Saat ingin melihat atau mengatur informasi proyek, dependensi, dan scripts yang tersedia.</w:t>
+            </w:r>
           </w:p>
         </w:tc>
       </w:tr>
@@ -18664,11 +19061,16 @@
           <w:p>
             <w:pPr>
               <w:spacing w:before="20" w:after="20" w:line="252" w:lineRule="auto"/>
-            </w:pPr>
-            <w:r>
-              <w:rPr>
-                <w:rFonts w:cs="Carlito"/>
-                <w:sz w:val="19"/>
+              <w:rPr>
+                <w:sz w:val="20"/>
+                <w:szCs w:val="20"/>
+              </w:rPr>
+            </w:pPr>
+            <w:r>
+              <w:rPr>
+                <w:rFonts w:cs="Carlito"/>
+                <w:sz w:val="20"/>
+                <w:szCs w:val="20"/>
               </w:rPr>
               <w:t>package-lock.json</w:t>
             </w:r>
@@ -18687,11 +19089,16 @@
           <w:p>
             <w:pPr>
               <w:spacing w:before="20" w:after="20" w:line="252" w:lineRule="auto"/>
-            </w:pPr>
-            <w:r>
-              <w:rPr>
-                <w:rFonts w:cs="Carlito"/>
-                <w:sz w:val="19"/>
+              <w:rPr>
+                <w:sz w:val="20"/>
+                <w:szCs w:val="20"/>
+              </w:rPr>
+            </w:pPr>
+            <w:r>
+              <w:rPr>
+                <w:rFonts w:cs="Carlito"/>
+                <w:sz w:val="20"/>
+                <w:szCs w:val="20"/>
               </w:rPr>
               <w:t>Mengunci versi tepat seluruh paket</w:t>
             </w:r>
@@ -18710,7 +19117,18 @@
           <w:p>
             <w:pPr>
               <w:spacing w:before="20" w:after="20" w:line="252" w:lineRule="auto"/>
-            </w:pPr>
+              <w:rPr>
+                <w:sz w:val="20"/>
+                <w:szCs w:val="20"/>
+              </w:rPr>
+            </w:pPr>
+            <w:r>
+              <w:rPr>
+                <w:sz w:val="20"/>
+                <w:szCs w:val="20"/>
+              </w:rPr>
+              <w:t>Saat memastikan versi dependensi yang terpasang tetap konsisten di berbagai komputer.</w:t>
+            </w:r>
           </w:p>
         </w:tc>
       </w:tr>
@@ -18733,11 +19151,16 @@
           <w:p>
             <w:pPr>
               <w:spacing w:before="20" w:after="20" w:line="252" w:lineRule="auto"/>
-            </w:pPr>
-            <w:r>
-              <w:rPr>
-                <w:rFonts w:cs="Carlito"/>
-                <w:sz w:val="19"/>
+              <w:rPr>
+                <w:sz w:val="20"/>
+                <w:szCs w:val="20"/>
+              </w:rPr>
+            </w:pPr>
+            <w:r>
+              <w:rPr>
+                <w:rFonts w:cs="Carlito"/>
+                <w:sz w:val="20"/>
+                <w:szCs w:val="20"/>
               </w:rPr>
               <w:t>reactive({ })</w:t>
             </w:r>
@@ -18756,11 +19179,16 @@
           <w:p>
             <w:pPr>
               <w:spacing w:before="20" w:after="20" w:line="252" w:lineRule="auto"/>
-            </w:pPr>
-            <w:r>
-              <w:rPr>
-                <w:rFonts w:cs="Carlito"/>
-                <w:sz w:val="19"/>
+              <w:rPr>
+                <w:sz w:val="20"/>
+                <w:szCs w:val="20"/>
+              </w:rPr>
+            </w:pPr>
+            <w:r>
+              <w:rPr>
+                <w:rFonts w:cs="Carlito"/>
+                <w:sz w:val="20"/>
+                <w:szCs w:val="20"/>
               </w:rPr>
               <w:t>Objek state yang tampilan mengikutinya</w:t>
             </w:r>
@@ -18779,7 +19207,18 @@
           <w:p>
             <w:pPr>
               <w:spacing w:before="20" w:after="20" w:line="252" w:lineRule="auto"/>
-            </w:pPr>
+              <w:rPr>
+                <w:sz w:val="20"/>
+                <w:szCs w:val="20"/>
+              </w:rPr>
+            </w:pPr>
+            <w:r>
+              <w:rPr>
+                <w:sz w:val="20"/>
+                <w:szCs w:val="20"/>
+              </w:rPr>
+              <w:t>Saat membuat objek reaktif yang perubahan datanya akan memperbarui tampilan secara otomatis.</w:t>
+            </w:r>
           </w:p>
         </w:tc>
       </w:tr>
@@ -18802,13 +19241,17 @@
           <w:p>
             <w:pPr>
               <w:spacing w:before="20" w:after="20" w:line="252" w:lineRule="auto"/>
-            </w:pPr>
-            <w:r>
-              <w:rPr>
-                <w:rFonts w:cs="Carlito"/>
-                <w:sz w:val="19"/>
-              </w:rPr>
-              <w:lastRenderedPageBreak/>
+              <w:rPr>
+                <w:sz w:val="20"/>
+                <w:szCs w:val="20"/>
+              </w:rPr>
+            </w:pPr>
+            <w:r>
+              <w:rPr>
+                <w:rFonts w:cs="Carlito"/>
+                <w:sz w:val="20"/>
+                <w:szCs w:val="20"/>
+              </w:rPr>
               <w:t>ref(nilai)</w:t>
             </w:r>
           </w:p>
@@ -18826,11 +19269,16 @@
           <w:p>
             <w:pPr>
               <w:spacing w:before="20" w:after="20" w:line="252" w:lineRule="auto"/>
-            </w:pPr>
-            <w:r>
-              <w:rPr>
-                <w:rFonts w:cs="Carlito"/>
-                <w:sz w:val="19"/>
+              <w:rPr>
+                <w:sz w:val="20"/>
+                <w:szCs w:val="20"/>
+              </w:rPr>
+            </w:pPr>
+            <w:r>
+              <w:rPr>
+                <w:rFonts w:cs="Carlito"/>
+                <w:sz w:val="20"/>
+                <w:szCs w:val="20"/>
               </w:rPr>
               <w:t>Nilai tunggal yang reaktif</w:t>
             </w:r>
@@ -18849,7 +19297,18 @@
           <w:p>
             <w:pPr>
               <w:spacing w:before="20" w:after="20" w:line="252" w:lineRule="auto"/>
-            </w:pPr>
+              <w:rPr>
+                <w:sz w:val="20"/>
+                <w:szCs w:val="20"/>
+              </w:rPr>
+            </w:pPr>
+            <w:r>
+              <w:rPr>
+                <w:sz w:val="20"/>
+                <w:szCs w:val="20"/>
+              </w:rPr>
+              <w:t>Saat membuat variabel reaktif untuk menyimpan satu nilai, seperti angka, teks, atau boolean.</w:t>
+            </w:r>
           </w:p>
         </w:tc>
       </w:tr>
@@ -18872,11 +19331,16 @@
           <w:p>
             <w:pPr>
               <w:spacing w:before="20" w:after="20" w:line="252" w:lineRule="auto"/>
-            </w:pPr>
-            <w:r>
-              <w:rPr>
-                <w:rFonts w:cs="Carlito"/>
-                <w:sz w:val="19"/>
+              <w:rPr>
+                <w:sz w:val="20"/>
+                <w:szCs w:val="20"/>
+              </w:rPr>
+            </w:pPr>
+            <w:r>
+              <w:rPr>
+                <w:rFonts w:cs="Carlito"/>
+                <w:sz w:val="20"/>
+                <w:szCs w:val="20"/>
               </w:rPr>
               <w:t>defineProps({ })</w:t>
             </w:r>
@@ -18895,11 +19359,16 @@
           <w:p>
             <w:pPr>
               <w:spacing w:before="20" w:after="20" w:line="252" w:lineRule="auto"/>
-            </w:pPr>
-            <w:r>
-              <w:rPr>
-                <w:rFonts w:cs="Carlito"/>
-                <w:sz w:val="19"/>
+              <w:rPr>
+                <w:sz w:val="20"/>
+                <w:szCs w:val="20"/>
+              </w:rPr>
+            </w:pPr>
+            <w:r>
+              <w:rPr>
+                <w:rFonts w:cs="Carlito"/>
+                <w:sz w:val="20"/>
+                <w:szCs w:val="20"/>
               </w:rPr>
               <w:t>Menyatakan data yang diterima dari induk</w:t>
             </w:r>
@@ -18918,7 +19387,18 @@
           <w:p>
             <w:pPr>
               <w:spacing w:before="20" w:after="20" w:line="252" w:lineRule="auto"/>
-            </w:pPr>
+              <w:rPr>
+                <w:sz w:val="20"/>
+                <w:szCs w:val="20"/>
+              </w:rPr>
+            </w:pPr>
+            <w:r>
+              <w:rPr>
+                <w:sz w:val="20"/>
+                <w:szCs w:val="20"/>
+              </w:rPr>
+              <w:t>Saat komponen anak menerima data atau properti dari komponen induk.</w:t>
+            </w:r>
           </w:p>
         </w:tc>
       </w:tr>
@@ -18941,11 +19421,16 @@
           <w:p>
             <w:pPr>
               <w:spacing w:before="20" w:after="20" w:line="252" w:lineRule="auto"/>
-            </w:pPr>
-            <w:r>
-              <w:rPr>
-                <w:rFonts w:cs="Carlito"/>
-                <w:sz w:val="19"/>
+              <w:rPr>
+                <w:sz w:val="20"/>
+                <w:szCs w:val="20"/>
+              </w:rPr>
+            </w:pPr>
+            <w:r>
+              <w:rPr>
+                <w:rFonts w:cs="Carlito"/>
+                <w:sz w:val="20"/>
+                <w:szCs w:val="20"/>
               </w:rPr>
               <w:t>v-for / v-if</w:t>
             </w:r>
@@ -18964,11 +19449,16 @@
           <w:p>
             <w:pPr>
               <w:spacing w:before="20" w:after="20" w:line="252" w:lineRule="auto"/>
-            </w:pPr>
-            <w:r>
-              <w:rPr>
-                <w:rFonts w:cs="Carlito"/>
-                <w:sz w:val="19"/>
+              <w:rPr>
+                <w:sz w:val="20"/>
+                <w:szCs w:val="20"/>
+              </w:rPr>
+            </w:pPr>
+            <w:r>
+              <w:rPr>
+                <w:rFonts w:cs="Carlito"/>
+                <w:sz w:val="20"/>
+                <w:szCs w:val="20"/>
               </w:rPr>
               <w:t>Padanan map dan filter</w:t>
             </w:r>
@@ -18987,7 +19477,18 @@
           <w:p>
             <w:pPr>
               <w:spacing w:before="20" w:after="20" w:line="252" w:lineRule="auto"/>
-            </w:pPr>
+              <w:rPr>
+                <w:sz w:val="20"/>
+                <w:szCs w:val="20"/>
+              </w:rPr>
+            </w:pPr>
+            <w:r>
+              <w:rPr>
+                <w:sz w:val="20"/>
+                <w:szCs w:val="20"/>
+              </w:rPr>
+              <w:t>v-for digunakan saat menampilkan daftar data, sedangkan v-if digunakan saat menampilkan elemen berdasarkan kondisi tertentu.</w:t>
+            </w:r>
           </w:p>
         </w:tc>
       </w:tr>
@@ -19010,11 +19511,16 @@
           <w:p>
             <w:pPr>
               <w:spacing w:before="20" w:after="20" w:line="252" w:lineRule="auto"/>
-            </w:pPr>
-            <w:r>
-              <w:rPr>
-                <w:rFonts w:cs="Carlito"/>
-                <w:sz w:val="19"/>
+              <w:rPr>
+                <w:sz w:val="20"/>
+                <w:szCs w:val="20"/>
+              </w:rPr>
+            </w:pPr>
+            <w:r>
+              <w:rPr>
+                <w:rFonts w:cs="Carlito"/>
+                <w:sz w:val="20"/>
+                <w:szCs w:val="20"/>
               </w:rPr>
               <w:t>v-model</w:t>
             </w:r>
@@ -19033,11 +19539,16 @@
           <w:p>
             <w:pPr>
               <w:spacing w:before="20" w:after="20" w:line="252" w:lineRule="auto"/>
-            </w:pPr>
-            <w:r>
-              <w:rPr>
-                <w:rFonts w:cs="Carlito"/>
-                <w:sz w:val="19"/>
+              <w:rPr>
+                <w:sz w:val="20"/>
+                <w:szCs w:val="20"/>
+              </w:rPr>
+            </w:pPr>
+            <w:r>
+              <w:rPr>
+                <w:rFonts w:cs="Carlito"/>
+                <w:sz w:val="20"/>
+                <w:szCs w:val="20"/>
               </w:rPr>
               <w:t>Mengikat isi form dua arah</w:t>
             </w:r>
@@ -19056,7 +19567,18 @@
           <w:p>
             <w:pPr>
               <w:spacing w:before="20" w:after="20" w:line="252" w:lineRule="auto"/>
-            </w:pPr>
+              <w:rPr>
+                <w:sz w:val="20"/>
+                <w:szCs w:val="20"/>
+              </w:rPr>
+            </w:pPr>
+            <w:r>
+              <w:rPr>
+                <w:sz w:val="20"/>
+                <w:szCs w:val="20"/>
+              </w:rPr>
+              <w:t>Saat menghubungkan input formulir dengan data secara dua arah.</w:t>
+            </w:r>
           </w:p>
         </w:tc>
       </w:tr>
@@ -19079,11 +19601,16 @@
           <w:p>
             <w:pPr>
               <w:spacing w:before="20" w:after="20" w:line="252" w:lineRule="auto"/>
-            </w:pPr>
-            <w:r>
-              <w:rPr>
-                <w:rFonts w:cs="Carlito"/>
-                <w:sz w:val="19"/>
+              <w:rPr>
+                <w:sz w:val="20"/>
+                <w:szCs w:val="20"/>
+              </w:rPr>
+            </w:pPr>
+            <w:r>
+              <w:rPr>
+                <w:rFonts w:cs="Carlito"/>
+                <w:sz w:val="20"/>
+                <w:szCs w:val="20"/>
               </w:rPr>
               <w:t>watch</w:t>
             </w:r>
@@ -19102,11 +19629,16 @@
           <w:p>
             <w:pPr>
               <w:spacing w:before="20" w:after="20" w:line="252" w:lineRule="auto"/>
-            </w:pPr>
-            <w:r>
-              <w:rPr>
-                <w:rFonts w:cs="Carlito"/>
-                <w:sz w:val="19"/>
+              <w:rPr>
+                <w:sz w:val="20"/>
+                <w:szCs w:val="20"/>
+              </w:rPr>
+            </w:pPr>
+            <w:r>
+              <w:rPr>
+                <w:rFonts w:cs="Carlito"/>
+                <w:sz w:val="20"/>
+                <w:szCs w:val="20"/>
               </w:rPr>
               <w:t>Menjalankan sesuatu saat nilai berubah</w:t>
             </w:r>
@@ -19125,7 +19657,18 @@
           <w:p>
             <w:pPr>
               <w:spacing w:before="20" w:after="20" w:line="252" w:lineRule="auto"/>
-            </w:pPr>
+              <w:rPr>
+                <w:sz w:val="20"/>
+                <w:szCs w:val="20"/>
+              </w:rPr>
+            </w:pPr>
+            <w:r>
+              <w:rPr>
+                <w:sz w:val="20"/>
+                <w:szCs w:val="20"/>
+              </w:rPr>
+              <w:t>Saat ingin menjalankan fungsi ketika nilai data reaktif tertentu berubah.</w:t>
+            </w:r>
           </w:p>
         </w:tc>
       </w:tr>
@@ -19148,11 +19691,16 @@
           <w:p>
             <w:pPr>
               <w:spacing w:before="20" w:after="20" w:line="252" w:lineRule="auto"/>
-            </w:pPr>
-            <w:r>
-              <w:rPr>
-                <w:rFonts w:cs="Carlito"/>
-                <w:sz w:val="19"/>
+              <w:rPr>
+                <w:sz w:val="20"/>
+                <w:szCs w:val="20"/>
+              </w:rPr>
+            </w:pPr>
+            <w:r>
+              <w:rPr>
+                <w:rFonts w:cs="Carlito"/>
+                <w:sz w:val="20"/>
+                <w:szCs w:val="20"/>
               </w:rPr>
               <w:t>onMounted</w:t>
             </w:r>
@@ -19171,11 +19719,16 @@
           <w:p>
             <w:pPr>
               <w:spacing w:before="20" w:after="20" w:line="252" w:lineRule="auto"/>
-            </w:pPr>
-            <w:r>
-              <w:rPr>
-                <w:rFonts w:cs="Carlito"/>
-                <w:sz w:val="19"/>
+              <w:rPr>
+                <w:sz w:val="20"/>
+                <w:szCs w:val="20"/>
+              </w:rPr>
+            </w:pPr>
+            <w:r>
+              <w:rPr>
+                <w:rFonts w:cs="Carlito"/>
+                <w:sz w:val="20"/>
+                <w:szCs w:val="20"/>
               </w:rPr>
               <w:t>Menjalankan sesuatu sekali saat komponen dipasang</w:t>
             </w:r>
@@ -19194,7 +19747,18 @@
           <w:p>
             <w:pPr>
               <w:spacing w:before="20" w:after="20" w:line="252" w:lineRule="auto"/>
-            </w:pPr>
+              <w:rPr>
+                <w:sz w:val="20"/>
+                <w:szCs w:val="20"/>
+              </w:rPr>
+            </w:pPr>
+            <w:r>
+              <w:rPr>
+                <w:sz w:val="20"/>
+                <w:szCs w:val="20"/>
+              </w:rPr>
+              <w:t>Saat ingin menjalankan kode setelah komponen selesai dipasang ke halaman.</w:t>
+            </w:r>
           </w:p>
         </w:tc>
       </w:tr>
@@ -19217,11 +19781,16 @@
           <w:p>
             <w:pPr>
               <w:spacing w:before="20" w:after="20" w:line="252" w:lineRule="auto"/>
-            </w:pPr>
-            <w:r>
-              <w:rPr>
-                <w:rFonts w:cs="Carlito"/>
-                <w:sz w:val="19"/>
+              <w:rPr>
+                <w:sz w:val="20"/>
+                <w:szCs w:val="20"/>
+              </w:rPr>
+            </w:pPr>
+            <w:r>
+              <w:rPr>
+                <w:rFonts w:cs="Carlito"/>
+                <w:sz w:val="20"/>
+                <w:szCs w:val="20"/>
               </w:rPr>
               <w:t>ambilNotisia()</w:t>
             </w:r>
@@ -19240,11 +19809,16 @@
           <w:p>
             <w:pPr>
               <w:spacing w:before="20" w:after="20" w:line="252" w:lineRule="auto"/>
-            </w:pPr>
-            <w:r>
-              <w:rPr>
-                <w:rFonts w:cs="Carlito"/>
-                <w:sz w:val="19"/>
+              <w:rPr>
+                <w:sz w:val="20"/>
+                <w:szCs w:val="20"/>
+              </w:rPr>
+            </w:pPr>
+            <w:r>
+              <w:rPr>
+                <w:rFonts w:cs="Carlito"/>
+                <w:sz w:val="20"/>
+                <w:szCs w:val="20"/>
               </w:rPr>
               <w:t>Mengambil data dari API lewat js/api.js (P10)</w:t>
             </w:r>
@@ -19263,15 +19837,20 @@
           <w:p>
             <w:pPr>
               <w:spacing w:before="20" w:after="20" w:line="252" w:lineRule="auto"/>
-            </w:pPr>
-            <w:r>
-              <w:rPr>
-                <w:rFonts w:cs="Carlito"/>
-                <w:b/>
-                <w:color w:val="FFFFFF"/>
-                <w:sz w:val="19"/>
-              </w:rPr>
-              <w:t>Saat data perlu diambil dari jaringan</w:t>
+              <w:rPr>
+                <w:bCs/>
+                <w:sz w:val="20"/>
+                <w:szCs w:val="20"/>
+              </w:rPr>
+            </w:pPr>
+            <w:r>
+              <w:rPr>
+                <w:rFonts w:cs="Carlito"/>
+                <w:bCs/>
+                <w:sz w:val="20"/>
+                <w:szCs w:val="20"/>
+              </w:rPr>
+              <w:t>Saat ingin mengambil data dari API melalui fetch atau Axios, misalnya ketika membutuhkan data berita dari server.</w:t>
             </w:r>
           </w:p>
         </w:tc>
@@ -20338,6 +20917,7 @@
           <w:rFonts w:cs="Carlito"/>
           <w:sz w:val="20"/>
         </w:rPr>
+        <w:lastRenderedPageBreak/>
         <w:t>Pertemuan 13 adalah Ujian CPMK Blok 2 — bahan ujiannya DOM, event, dan API JSON, seluruhnya vanilla. Pertemuan 14 melanjutkan dari folder dist/ yang Anda hasilkan hari ini, jadi simpan pekerjaan ini rapi di repositori Anda.</w:t>
       </w:r>
     </w:p>
@@ -20411,7 +20991,6 @@
           <w:b/>
           <w:color w:val="003796"/>
         </w:rPr>
-        <w:lastRenderedPageBreak/>
         <w:t>Tiga perintah yang akan Anda pakai terus</w:t>
       </w:r>
     </w:p>
@@ -21149,7 +21728,7 @@
       </w:pPr>
     </w:p>
     <w:sectPr>
-      <w:footerReference w:type="default" r:id="rId11"/>
+      <w:footerReference w:type="default" r:id="rId17"/>
       <w:pgSz w:w="11906" w:h="16838"/>
       <w:pgMar w:top="964" w:right="1077" w:bottom="907" w:left="1077" w:header="720" w:footer="720" w:gutter="0"/>
       <w:cols w:space="720"/>
@@ -22063,7 +22642,6 @@
   <w:style w:type="character" w:default="1" w:styleId="DefaultParagraphFont">
     <w:name w:val="Default Paragraph Font"/>
     <w:uiPriority w:val="1"/>
-    <w:semiHidden/>
     <w:unhideWhenUsed/>
   </w:style>
   <w:style w:type="table" w:default="1" w:styleId="TableNormal">

</xml_diff>

<commit_message>
P12 - aset P11 dipindahkan apa adanya
</commit_message>
<xml_diff>
--- a/worksheet-p12/25523236-Diah Putri Pertiwi.docx
+++ b/worksheet-p12/25523236-Diah Putri Pertiwi.docx
@@ -7622,6 +7622,43 @@
             <w:pPr>
               <w:spacing w:before="20" w:after="20" w:line="252" w:lineRule="auto"/>
             </w:pPr>
+            <w:r>
+              <w:drawing>
+                <wp:inline distT="0" distB="0" distL="0" distR="0" wp14:anchorId="0DE3CB93" wp14:editId="77058ACF">
+                  <wp:extent cx="1831975" cy="780415"/>
+                  <wp:effectExtent l="0" t="0" r="0" b="635"/>
+                  <wp:docPr id="407165437" name="Picture 1"/>
+                  <wp:cNvGraphicFramePr>
+                    <a:graphicFrameLocks xmlns:a="http://schemas.openxmlformats.org/drawingml/2006/main" noChangeAspect="1"/>
+                  </wp:cNvGraphicFramePr>
+                  <a:graphic xmlns:a="http://schemas.openxmlformats.org/drawingml/2006/main">
+                    <a:graphicData uri="http://schemas.openxmlformats.org/drawingml/2006/picture">
+                      <pic:pic xmlns:pic="http://schemas.openxmlformats.org/drawingml/2006/picture">
+                        <pic:nvPicPr>
+                          <pic:cNvPr id="407165437" name=""/>
+                          <pic:cNvPicPr/>
+                        </pic:nvPicPr>
+                        <pic:blipFill>
+                          <a:blip r:embed="rId17"/>
+                          <a:stretch>
+                            <a:fillRect/>
+                          </a:stretch>
+                        </pic:blipFill>
+                        <pic:spPr>
+                          <a:xfrm>
+                            <a:off x="0" y="0"/>
+                            <a:ext cx="1831975" cy="780415"/>
+                          </a:xfrm>
+                          <a:prstGeom prst="rect">
+                            <a:avLst/>
+                          </a:prstGeom>
+                        </pic:spPr>
+                      </pic:pic>
+                    </a:graphicData>
+                  </a:graphic>
+                </wp:inline>
+              </w:drawing>
+            </w:r>
           </w:p>
         </w:tc>
       </w:tr>
@@ -7691,6 +7728,43 @@
             <w:pPr>
               <w:spacing w:before="20" w:after="20" w:line="252" w:lineRule="auto"/>
             </w:pPr>
+            <w:r>
+              <w:drawing>
+                <wp:inline distT="0" distB="0" distL="0" distR="0" wp14:anchorId="420D0D0C" wp14:editId="09BA4B45">
+                  <wp:extent cx="1831975" cy="1847850"/>
+                  <wp:effectExtent l="0" t="0" r="0" b="0"/>
+                  <wp:docPr id="412624678" name="Picture 1"/>
+                  <wp:cNvGraphicFramePr>
+                    <a:graphicFrameLocks xmlns:a="http://schemas.openxmlformats.org/drawingml/2006/main" noChangeAspect="1"/>
+                  </wp:cNvGraphicFramePr>
+                  <a:graphic xmlns:a="http://schemas.openxmlformats.org/drawingml/2006/main">
+                    <a:graphicData uri="http://schemas.openxmlformats.org/drawingml/2006/picture">
+                      <pic:pic xmlns:pic="http://schemas.openxmlformats.org/drawingml/2006/picture">
+                        <pic:nvPicPr>
+                          <pic:cNvPr id="412624678" name=""/>
+                          <pic:cNvPicPr/>
+                        </pic:nvPicPr>
+                        <pic:blipFill>
+                          <a:blip r:embed="rId18"/>
+                          <a:stretch>
+                            <a:fillRect/>
+                          </a:stretch>
+                        </pic:blipFill>
+                        <pic:spPr>
+                          <a:xfrm>
+                            <a:off x="0" y="0"/>
+                            <a:ext cx="1831975" cy="1847850"/>
+                          </a:xfrm>
+                          <a:prstGeom prst="rect">
+                            <a:avLst/>
+                          </a:prstGeom>
+                        </pic:spPr>
+                      </pic:pic>
+                    </a:graphicData>
+                  </a:graphic>
+                </wp:inline>
+              </w:drawing>
+            </w:r>
           </w:p>
         </w:tc>
       </w:tr>
@@ -7760,6 +7834,43 @@
             <w:pPr>
               <w:spacing w:before="20" w:after="20" w:line="252" w:lineRule="auto"/>
             </w:pPr>
+            <w:r>
+              <w:drawing>
+                <wp:inline distT="0" distB="0" distL="0" distR="0" wp14:anchorId="5BA257C4" wp14:editId="7E0DE2A6">
+                  <wp:extent cx="1831975" cy="699770"/>
+                  <wp:effectExtent l="0" t="0" r="0" b="5080"/>
+                  <wp:docPr id="449030580" name="Picture 1"/>
+                  <wp:cNvGraphicFramePr>
+                    <a:graphicFrameLocks xmlns:a="http://schemas.openxmlformats.org/drawingml/2006/main" noChangeAspect="1"/>
+                  </wp:cNvGraphicFramePr>
+                  <a:graphic xmlns:a="http://schemas.openxmlformats.org/drawingml/2006/main">
+                    <a:graphicData uri="http://schemas.openxmlformats.org/drawingml/2006/picture">
+                      <pic:pic xmlns:pic="http://schemas.openxmlformats.org/drawingml/2006/picture">
+                        <pic:nvPicPr>
+                          <pic:cNvPr id="449030580" name=""/>
+                          <pic:cNvPicPr/>
+                        </pic:nvPicPr>
+                        <pic:blipFill>
+                          <a:blip r:embed="rId19"/>
+                          <a:stretch>
+                            <a:fillRect/>
+                          </a:stretch>
+                        </pic:blipFill>
+                        <pic:spPr>
+                          <a:xfrm>
+                            <a:off x="0" y="0"/>
+                            <a:ext cx="1831975" cy="699770"/>
+                          </a:xfrm>
+                          <a:prstGeom prst="rect">
+                            <a:avLst/>
+                          </a:prstGeom>
+                        </pic:spPr>
+                      </pic:pic>
+                    </a:graphicData>
+                  </a:graphic>
+                </wp:inline>
+              </w:drawing>
+            </w:r>
           </w:p>
         </w:tc>
       </w:tr>
@@ -7829,6 +7940,43 @@
             <w:pPr>
               <w:spacing w:before="20" w:after="20" w:line="252" w:lineRule="auto"/>
             </w:pPr>
+            <w:r>
+              <w:drawing>
+                <wp:inline distT="0" distB="0" distL="0" distR="0" wp14:anchorId="6775D6BC" wp14:editId="2EBBD36C">
+                  <wp:extent cx="1831975" cy="749935"/>
+                  <wp:effectExtent l="0" t="0" r="0" b="0"/>
+                  <wp:docPr id="1127992056" name="Picture 1"/>
+                  <wp:cNvGraphicFramePr>
+                    <a:graphicFrameLocks xmlns:a="http://schemas.openxmlformats.org/drawingml/2006/main" noChangeAspect="1"/>
+                  </wp:cNvGraphicFramePr>
+                  <a:graphic xmlns:a="http://schemas.openxmlformats.org/drawingml/2006/main">
+                    <a:graphicData uri="http://schemas.openxmlformats.org/drawingml/2006/picture">
+                      <pic:pic xmlns:pic="http://schemas.openxmlformats.org/drawingml/2006/picture">
+                        <pic:nvPicPr>
+                          <pic:cNvPr id="1127992056" name=""/>
+                          <pic:cNvPicPr/>
+                        </pic:nvPicPr>
+                        <pic:blipFill>
+                          <a:blip r:embed="rId20"/>
+                          <a:stretch>
+                            <a:fillRect/>
+                          </a:stretch>
+                        </pic:blipFill>
+                        <pic:spPr>
+                          <a:xfrm>
+                            <a:off x="0" y="0"/>
+                            <a:ext cx="1831975" cy="749935"/>
+                          </a:xfrm>
+                          <a:prstGeom prst="rect">
+                            <a:avLst/>
+                          </a:prstGeom>
+                        </pic:spPr>
+                      </pic:pic>
+                    </a:graphicData>
+                  </a:graphic>
+                </wp:inline>
+              </w:drawing>
+            </w:r>
           </w:p>
         </w:tc>
       </w:tr>
@@ -7857,6 +8005,7 @@
                 <w:rFonts w:cs="Carlito"/>
                 <w:sz w:val="18"/>
               </w:rPr>
+              <w:lastRenderedPageBreak/>
               <w:t>Berkas contoh Vue</w:t>
             </w:r>
           </w:p>
@@ -7898,6 +8047,43 @@
             <w:pPr>
               <w:spacing w:before="20" w:after="20" w:line="252" w:lineRule="auto"/>
             </w:pPr>
+            <w:r>
+              <w:drawing>
+                <wp:inline distT="0" distB="0" distL="0" distR="0" wp14:anchorId="4D7D71FD" wp14:editId="608AE31B">
+                  <wp:extent cx="1581231" cy="3187864"/>
+                  <wp:effectExtent l="0" t="0" r="0" b="0"/>
+                  <wp:docPr id="810115071" name="Picture 1"/>
+                  <wp:cNvGraphicFramePr>
+                    <a:graphicFrameLocks xmlns:a="http://schemas.openxmlformats.org/drawingml/2006/main" noChangeAspect="1"/>
+                  </wp:cNvGraphicFramePr>
+                  <a:graphic xmlns:a="http://schemas.openxmlformats.org/drawingml/2006/main">
+                    <a:graphicData uri="http://schemas.openxmlformats.org/drawingml/2006/picture">
+                      <pic:pic xmlns:pic="http://schemas.openxmlformats.org/drawingml/2006/picture">
+                        <pic:nvPicPr>
+                          <pic:cNvPr id="810115071" name=""/>
+                          <pic:cNvPicPr/>
+                        </pic:nvPicPr>
+                        <pic:blipFill>
+                          <a:blip r:embed="rId21"/>
+                          <a:stretch>
+                            <a:fillRect/>
+                          </a:stretch>
+                        </pic:blipFill>
+                        <pic:spPr>
+                          <a:xfrm>
+                            <a:off x="0" y="0"/>
+                            <a:ext cx="1581231" cy="3187864"/>
+                          </a:xfrm>
+                          <a:prstGeom prst="rect">
+                            <a:avLst/>
+                          </a:prstGeom>
+                        </pic:spPr>
+                      </pic:pic>
+                    </a:graphicData>
+                  </a:graphic>
+                </wp:inline>
+              </w:drawing>
+            </w:r>
           </w:p>
         </w:tc>
       </w:tr>
@@ -8545,6 +8731,43 @@
             <w:pPr>
               <w:spacing w:before="20" w:after="20" w:line="252" w:lineRule="auto"/>
             </w:pPr>
+            <w:r>
+              <w:drawing>
+                <wp:inline distT="0" distB="0" distL="0" distR="0" wp14:anchorId="6FDD5817" wp14:editId="198951D6">
+                  <wp:extent cx="1831975" cy="851535"/>
+                  <wp:effectExtent l="0" t="0" r="0" b="5715"/>
+                  <wp:docPr id="256454574" name="Picture 1"/>
+                  <wp:cNvGraphicFramePr>
+                    <a:graphicFrameLocks xmlns:a="http://schemas.openxmlformats.org/drawingml/2006/main" noChangeAspect="1"/>
+                  </wp:cNvGraphicFramePr>
+                  <a:graphic xmlns:a="http://schemas.openxmlformats.org/drawingml/2006/main">
+                    <a:graphicData uri="http://schemas.openxmlformats.org/drawingml/2006/picture">
+                      <pic:pic xmlns:pic="http://schemas.openxmlformats.org/drawingml/2006/picture">
+                        <pic:nvPicPr>
+                          <pic:cNvPr id="256454574" name=""/>
+                          <pic:cNvPicPr/>
+                        </pic:nvPicPr>
+                        <pic:blipFill>
+                          <a:blip r:embed="rId22"/>
+                          <a:stretch>
+                            <a:fillRect/>
+                          </a:stretch>
+                        </pic:blipFill>
+                        <pic:spPr>
+                          <a:xfrm>
+                            <a:off x="0" y="0"/>
+                            <a:ext cx="1831975" cy="851535"/>
+                          </a:xfrm>
+                          <a:prstGeom prst="rect">
+                            <a:avLst/>
+                          </a:prstGeom>
+                        </pic:spPr>
+                      </pic:pic>
+                    </a:graphicData>
+                  </a:graphic>
+                </wp:inline>
+              </w:drawing>
+            </w:r>
           </w:p>
         </w:tc>
       </w:tr>
@@ -8573,6 +8796,7 @@
                 <w:rFonts w:cs="Carlito"/>
                 <w:sz w:val="18"/>
               </w:rPr>
+              <w:lastRenderedPageBreak/>
               <w:t>Berkas contoh Vite</w:t>
             </w:r>
           </w:p>
@@ -8614,6 +8838,43 @@
             <w:pPr>
               <w:spacing w:before="20" w:after="20" w:line="252" w:lineRule="auto"/>
             </w:pPr>
+            <w:r>
+              <w:drawing>
+                <wp:inline distT="0" distB="0" distL="0" distR="0" wp14:anchorId="5ACD8D17" wp14:editId="1AAA9A40">
+                  <wp:extent cx="1831975" cy="2054225"/>
+                  <wp:effectExtent l="0" t="0" r="0" b="3175"/>
+                  <wp:docPr id="1569198668" name="Picture 1"/>
+                  <wp:cNvGraphicFramePr>
+                    <a:graphicFrameLocks xmlns:a="http://schemas.openxmlformats.org/drawingml/2006/main" noChangeAspect="1"/>
+                  </wp:cNvGraphicFramePr>
+                  <a:graphic xmlns:a="http://schemas.openxmlformats.org/drawingml/2006/main">
+                    <a:graphicData uri="http://schemas.openxmlformats.org/drawingml/2006/picture">
+                      <pic:pic xmlns:pic="http://schemas.openxmlformats.org/drawingml/2006/picture">
+                        <pic:nvPicPr>
+                          <pic:cNvPr id="1569198668" name=""/>
+                          <pic:cNvPicPr/>
+                        </pic:nvPicPr>
+                        <pic:blipFill>
+                          <a:blip r:embed="rId23"/>
+                          <a:stretch>
+                            <a:fillRect/>
+                          </a:stretch>
+                        </pic:blipFill>
+                        <pic:spPr>
+                          <a:xfrm>
+                            <a:off x="0" y="0"/>
+                            <a:ext cx="1831975" cy="2054225"/>
+                          </a:xfrm>
+                          <a:prstGeom prst="rect">
+                            <a:avLst/>
+                          </a:prstGeom>
+                        </pic:spPr>
+                      </pic:pic>
+                    </a:graphicData>
+                  </a:graphic>
+                </wp:inline>
+              </w:drawing>
+            </w:r>
           </w:p>
         </w:tc>
       </w:tr>
@@ -8642,7 +8903,6 @@
                 <w:rFonts w:cs="Carlito"/>
                 <w:sz w:val="18"/>
               </w:rPr>
-              <w:lastRenderedPageBreak/>
               <w:t>Data</w:t>
             </w:r>
           </w:p>
@@ -8684,6 +8944,43 @@
             <w:pPr>
               <w:spacing w:before="20" w:after="20" w:line="252" w:lineRule="auto"/>
             </w:pPr>
+            <w:r>
+              <w:drawing>
+                <wp:inline distT="0" distB="0" distL="0" distR="0" wp14:anchorId="6D572CBC" wp14:editId="445C0A87">
+                  <wp:extent cx="1831975" cy="2257425"/>
+                  <wp:effectExtent l="0" t="0" r="0" b="9525"/>
+                  <wp:docPr id="1381767194" name="Picture 1"/>
+                  <wp:cNvGraphicFramePr>
+                    <a:graphicFrameLocks xmlns:a="http://schemas.openxmlformats.org/drawingml/2006/main" noChangeAspect="1"/>
+                  </wp:cNvGraphicFramePr>
+                  <a:graphic xmlns:a="http://schemas.openxmlformats.org/drawingml/2006/main">
+                    <a:graphicData uri="http://schemas.openxmlformats.org/drawingml/2006/picture">
+                      <pic:pic xmlns:pic="http://schemas.openxmlformats.org/drawingml/2006/picture">
+                        <pic:nvPicPr>
+                          <pic:cNvPr id="1381767194" name=""/>
+                          <pic:cNvPicPr/>
+                        </pic:nvPicPr>
+                        <pic:blipFill>
+                          <a:blip r:embed="rId24"/>
+                          <a:stretch>
+                            <a:fillRect/>
+                          </a:stretch>
+                        </pic:blipFill>
+                        <pic:spPr>
+                          <a:xfrm>
+                            <a:off x="0" y="0"/>
+                            <a:ext cx="1831975" cy="2257425"/>
+                          </a:xfrm>
+                          <a:prstGeom prst="rect">
+                            <a:avLst/>
+                          </a:prstGeom>
+                        </pic:spPr>
+                      </pic:pic>
+                    </a:graphicData>
+                  </a:graphic>
+                </wp:inline>
+              </w:drawing>
+            </w:r>
           </w:p>
         </w:tc>
       </w:tr>
@@ -8753,6 +9050,9 @@
             <w:pPr>
               <w:spacing w:before="20" w:after="20" w:line="252" w:lineRule="auto"/>
             </w:pPr>
+            <w:r>
+              <w:t>Tidak ada yang dirubah.</w:t>
+            </w:r>
           </w:p>
         </w:tc>
       </w:tr>
@@ -15737,24 +16037,11 @@
               <w:right w:val="single" w:sz="4" w:space="0" w:color="B9C6E2"/>
             </w:tcBorders>
           </w:tcPr>
-          <w:p/>
-        </w:tc>
-      </w:tr>
-      <w:tr>
-        <w:trPr>
-          <w:trHeight w:val="351"/>
-        </w:trPr>
-        <w:tc>
-          <w:tcPr>
-            <w:tcW w:w="9751" w:type="dxa"/>
-            <w:tcBorders>
-              <w:top w:val="single" w:sz="4" w:space="0" w:color="B9C6E2"/>
-              <w:left w:val="single" w:sz="4" w:space="0" w:color="B9C6E2"/>
-              <w:bottom w:val="single" w:sz="4" w:space="0" w:color="B9C6E2"/>
-              <w:right w:val="single" w:sz="4" w:space="0" w:color="B9C6E2"/>
-            </w:tcBorders>
-          </w:tcPr>
-          <w:p/>
+          <w:p>
+            <w:r>
+              <w:t>dependencies berisi package yang dibutuhkan aplikasi saat dijalankan, contohnya vue. devDependencies berisi package untuk pengembangan, contohnya vite.</w:t>
+            </w:r>
+          </w:p>
         </w:tc>
       </w:tr>
     </w:tbl>
@@ -15799,24 +16086,11 @@
               <w:right w:val="single" w:sz="4" w:space="0" w:color="B9C6E2"/>
             </w:tcBorders>
           </w:tcPr>
-          <w:p/>
-        </w:tc>
-      </w:tr>
-      <w:tr>
-        <w:trPr>
-          <w:trHeight w:val="351"/>
-        </w:trPr>
-        <w:tc>
-          <w:tcPr>
-            <w:tcW w:w="9751" w:type="dxa"/>
-            <w:tcBorders>
-              <w:top w:val="single" w:sz="4" w:space="0" w:color="B9C6E2"/>
-              <w:left w:val="single" w:sz="4" w:space="0" w:color="B9C6E2"/>
-              <w:bottom w:val="single" w:sz="4" w:space="0" w:color="B9C6E2"/>
-              <w:right w:val="single" w:sz="4" w:space="0" w:color="B9C6E2"/>
-            </w:tcBorders>
-          </w:tcPr>
-          <w:p/>
+          <w:p>
+            <w:r>
+              <w:t>package-lock.json menyimpan versi pasti setiap package agar instalasi konsisten di setiap komputer. node_modules/ tidak perlu disimpan karena dapat dibuat kembali menggunakan perintah npm install dan ukurannya besar.</w:t>
+            </w:r>
+          </w:p>
         </w:tc>
       </w:tr>
     </w:tbl>
@@ -15861,24 +16135,11 @@
               <w:right w:val="single" w:sz="4" w:space="0" w:color="B9C6E2"/>
             </w:tcBorders>
           </w:tcPr>
-          <w:p/>
-        </w:tc>
-      </w:tr>
-      <w:tr>
-        <w:trPr>
-          <w:trHeight w:val="351"/>
-        </w:trPr>
-        <w:tc>
-          <w:tcPr>
-            <w:tcW w:w="9751" w:type="dxa"/>
-            <w:tcBorders>
-              <w:top w:val="single" w:sz="4" w:space="0" w:color="B9C6E2"/>
-              <w:left w:val="single" w:sz="4" w:space="0" w:color="B9C6E2"/>
-              <w:bottom w:val="single" w:sz="4" w:space="0" w:color="B9C6E2"/>
-              <w:right w:val="single" w:sz="4" w:space="0" w:color="B9C6E2"/>
-            </w:tcBorders>
-          </w:tcPr>
-          <w:p/>
+          <w:p>
+            <w:r>
+              <w:t>Perintah tersebut digunakan untuk membuat proyek Vue baru menggunakan Vite. Tanda titik (.) berarti proyek dibuat di direktori atau folder yang sedang aktif.</w:t>
+            </w:r>
+          </w:p>
         </w:tc>
       </w:tr>
     </w:tbl>
@@ -15923,24 +16184,11 @@
               <w:right w:val="single" w:sz="4" w:space="0" w:color="B9C6E2"/>
             </w:tcBorders>
           </w:tcPr>
-          <w:p/>
-        </w:tc>
-      </w:tr>
-      <w:tr>
-        <w:trPr>
-          <w:trHeight w:val="351"/>
-        </w:trPr>
-        <w:tc>
-          <w:tcPr>
-            <w:tcW w:w="9751" w:type="dxa"/>
-            <w:tcBorders>
-              <w:top w:val="single" w:sz="4" w:space="0" w:color="B9C6E2"/>
-              <w:left w:val="single" w:sz="4" w:space="0" w:color="B9C6E2"/>
-              <w:bottom w:val="single" w:sz="4" w:space="0" w:color="B9C6E2"/>
-              <w:right w:val="single" w:sz="4" w:space="0" w:color="B9C6E2"/>
-            </w:tcBorders>
-          </w:tcPr>
-          <w:p/>
+          <w:p>
+            <w:r>
+              <w:t>Di Vue, render(state) digantikan oleh sistem reaktivitas dan template Vue. Vue akan memperbarui tampilan secara otomatis ketika data reaktif berubah, tanpa perlu memanggil render() sendiri.</w:t>
+            </w:r>
+          </w:p>
         </w:tc>
       </w:tr>
     </w:tbl>
@@ -15985,24 +16233,11 @@
               <w:right w:val="single" w:sz="4" w:space="0" w:color="B9C6E2"/>
             </w:tcBorders>
           </w:tcPr>
-          <w:p/>
-        </w:tc>
-      </w:tr>
-      <w:tr>
-        <w:trPr>
-          <w:trHeight w:val="351"/>
-        </w:trPr>
-        <w:tc>
-          <w:tcPr>
-            <w:tcW w:w="9751" w:type="dxa"/>
-            <w:tcBorders>
-              <w:top w:val="single" w:sz="4" w:space="0" w:color="B9C6E2"/>
-              <w:left w:val="single" w:sz="4" w:space="0" w:color="B9C6E2"/>
-              <w:bottom w:val="single" w:sz="4" w:space="0" w:color="B9C6E2"/>
-              <w:right w:val="single" w:sz="4" w:space="0" w:color="B9C6E2"/>
-            </w:tcBorders>
-          </w:tcPr>
-          <w:p/>
+          <w:p>
+            <w:r>
+              <w:t>Props tidak boleh diubah karena merupakan data yang dikirim oleh komponen induk. Jika perlu mengubahnya, komponen anak sebaiknya mengirim event kepada induk.</w:t>
+            </w:r>
+          </w:p>
         </w:tc>
       </w:tr>
     </w:tbl>
@@ -16047,24 +16282,11 @@
               <w:right w:val="single" w:sz="4" w:space="0" w:color="B9C6E2"/>
             </w:tcBorders>
           </w:tcPr>
-          <w:p/>
-        </w:tc>
-      </w:tr>
-      <w:tr>
-        <w:trPr>
-          <w:trHeight w:val="351"/>
-        </w:trPr>
-        <w:tc>
-          <w:tcPr>
-            <w:tcW w:w="9751" w:type="dxa"/>
-            <w:tcBorders>
-              <w:top w:val="single" w:sz="4" w:space="0" w:color="B9C6E2"/>
-              <w:left w:val="single" w:sz="4" w:space="0" w:color="B9C6E2"/>
-              <w:bottom w:val="single" w:sz="4" w:space="0" w:color="B9C6E2"/>
-              <w:right w:val="single" w:sz="4" w:space="0" w:color="B9C6E2"/>
-            </w:tcBorders>
-          </w:tcPr>
-          <w:p/>
+          <w:p>
+            <w:r>
+              <w:t>npm run dev digunakan saat mengembangkan aplikasi dan melihat perubahan secara langsung. npm run preview digunakan untuk melihat hasil build produksi setelah menjalankan npm run build.</w:t>
+            </w:r>
+          </w:p>
         </w:tc>
       </w:tr>
     </w:tbl>
@@ -16109,24 +16331,11 @@
               <w:right w:val="single" w:sz="4" w:space="0" w:color="B9C6E2"/>
             </w:tcBorders>
           </w:tcPr>
-          <w:p/>
-        </w:tc>
-      </w:tr>
-      <w:tr>
-        <w:trPr>
-          <w:trHeight w:val="351"/>
-        </w:trPr>
-        <w:tc>
-          <w:tcPr>
-            <w:tcW w:w="9751" w:type="dxa"/>
-            <w:tcBorders>
-              <w:top w:val="single" w:sz="4" w:space="0" w:color="B9C6E2"/>
-              <w:left w:val="single" w:sz="4" w:space="0" w:color="B9C6E2"/>
-              <w:bottom w:val="single" w:sz="4" w:space="0" w:color="B9C6E2"/>
-              <w:right w:val="single" w:sz="4" w:space="0" w:color="B9C6E2"/>
-            </w:tcBorders>
-          </w:tcPr>
-          <w:p/>
+          <w:p>
+            <w:r>
+              <w:t>Folder dist/ diabaikan karena merupakan hasil build yang dapat dibuat kembali dengan npm run build. Folder ini dapat diunggah ke server produksi tanpa harus disimpan di repositori.</w:t>
+            </w:r>
+          </w:p>
         </w:tc>
       </w:tr>
     </w:tbl>
@@ -16257,7 +16466,6 @@
                 <w:color w:val="003796"/>
                 <w:sz w:val="22"/>
               </w:rPr>
-              <w:lastRenderedPageBreak/>
               <w:t>☐  Komponen  empat komponen tersusun; KepalaProfil menerima props profil; nama berkas dan impor ditulis sama</w:t>
             </w:r>
           </w:p>
@@ -16284,6 +16492,7 @@
                 <w:color w:val="003796"/>
                 <w:sz w:val="22"/>
               </w:rPr>
+              <w:lastRenderedPageBreak/>
               <w:t>☐  Keadaan  state memakai reactive(); tidak ada render(state) manual lagi</w:t>
             </w:r>
           </w:p>
@@ -18586,7 +18795,21 @@
                 <w:sz w:val="20"/>
                 <w:szCs w:val="20"/>
               </w:rPr>
-              <w:t>Saat membuat proyek React baru menggunakan Vite.</w:t>
+              <w:t xml:space="preserve">Saat membuat proyek </w:t>
+            </w:r>
+            <w:r>
+              <w:rPr>
+                <w:sz w:val="20"/>
+                <w:szCs w:val="20"/>
+              </w:rPr>
+              <w:t>Vue</w:t>
+            </w:r>
+            <w:r>
+              <w:rPr>
+                <w:sz w:val="20"/>
+                <w:szCs w:val="20"/>
+              </w:rPr>
+              <w:t xml:space="preserve"> baru menggunakan Vite.</w:t>
             </w:r>
           </w:p>
         </w:tc>
@@ -21728,7 +21951,7 @@
       </w:pPr>
     </w:p>
     <w:sectPr>
-      <w:footerReference w:type="default" r:id="rId17"/>
+      <w:footerReference w:type="default" r:id="rId25"/>
       <w:pgSz w:w="11906" w:h="16838"/>
       <w:pgMar w:top="964" w:right="1077" w:bottom="907" w:left="1077" w:header="720" w:footer="720" w:gutter="0"/>
       <w:cols w:space="720"/>

</xml_diff>

<commit_message>
p12-seluruh worksheet selesai dan siap dinilai
</commit_message>
<xml_diff>
--- a/worksheet-p12/25523236-Diah Putri Pertiwi.docx
+++ b/worksheet-p12/25523236-Diah Putri Pertiwi.docx
@@ -18801,7 +18801,14 @@
           <w:rFonts w:cs="Carlito"/>
           <w:sz w:val="20"/>
         </w:rPr>
-        <w:t>.00</w:t>
+        <w:t>.</w:t>
+      </w:r>
+      <w:r>
+        <w:rPr>
+          <w:rFonts w:cs="Carlito"/>
+          <w:sz w:val="20"/>
+        </w:rPr>
+        <w:t>10</w:t>
       </w:r>
     </w:p>
     <w:p>

</xml_diff>